<commit_message>
Speech final del Demo Day y solicitud JSON de ejemplo
- SPEECH_FINAL_DEMO_DAY.docx: speech para varios sectores, con la demo sobre «Normas de Conducta y Convivencia»
- SPEECH_FINAL_DEMO_DAY_SOLO.docx: versión para una sola persona
- presentacion_demor_day_kairos: actualizada con la marca Kairos y OCI funcionando
- adaptar_normas_conducta.json: cuerpo listo para POST /api/v1/adaptar
</commit_message>
<xml_diff>
--- a/presentacion_demor_day_kairos.docx
+++ b/presentacion_demor_day_kairos.docx
@@ -20,11 +20,48 @@
     </w:p>
     <w:p>
       <w:pPr>
-        <w:pStyle w:val="Title"/>
+        <w:spacing w:after="120" w:before="120"/>
         <w:jc w:val="center"/>
       </w:pPr>
       <w:r>
-        <w:t xml:space="preserve">NuevaMente</w:t>
+        <w:drawing>
+          <wp:inline distT="0" distB="0" distL="0" distR="0">
+            <wp:extent cx="3429000" cy="1543050"/>
+            <wp:effectExtent t="0" r="0" b="0" l="0"/>
+            <wp:docPr id="1" name="logo" descr="Logo de Kairos" title="Kairos"/>
+            <wp:cNvGraphicFramePr>
+              <a:graphicFrameLocks xmlns:a="http://schemas.openxmlformats.org/drawingml/2006/main" noChangeAspect="1"/>
+            </wp:cNvGraphicFramePr>
+            <a:graphic xmlns:a="http://schemas.openxmlformats.org/drawingml/2006/main">
+              <a:graphicData uri="http://schemas.openxmlformats.org/drawingml/2006/picture">
+                <pic:pic xmlns:pic="http://schemas.openxmlformats.org/drawingml/2006/picture">
+                  <pic:nvPicPr>
+                    <pic:cNvPr id="0" name="" descr=""/>
+                    <pic:cNvPicPr>
+                      <a:picLocks noChangeAspect="1" noChangeArrowheads="1"/>
+                    </pic:cNvPicPr>
+                  </pic:nvPicPr>
+                  <pic:blipFill>
+                    <a:blip r:embed="rId12" cstate="none"/>
+                    <a:srcRect/>
+                    <a:stretch>
+                      <a:fillRect/>
+                    </a:stretch>
+                  </pic:blipFill>
+                  <pic:spPr bwMode="auto">
+                    <a:xfrm>
+                      <a:off x="0" y="0"/>
+                      <a:ext cx="3429000" cy="1543050"/>
+                    </a:xfrm>
+                    <a:prstGeom prst="rect">
+                      <a:avLst/>
+                    </a:prstGeom>
+                  </pic:spPr>
+                </pic:pic>
+              </a:graphicData>
+            </a:graphic>
+          </wp:inline>
+        </w:drawing>
       </w:r>
     </w:p>
     <w:p>
@@ -40,7 +77,7 @@
           <w:sz w:val="26"/>
           <w:szCs w:val="26"/>
         </w:rPr>
-        <w:t xml:space="preserve">El conocimiento de su organización, al nivel de cada persona, sin inventar nada.</w:t>
+        <w:t xml:space="preserve">Kairos: el conocimiento de su organización, al nivel de cada persona, sin inventar nada.</w:t>
       </w:r>
     </w:p>
     <w:p>
@@ -69,7 +106,7 @@
       <w:r>
         <w:t xml:space="preserve">Aplicación en línea: </w:t>
       </w:r>
-      <w:hyperlink w:history="1" r:id="rIdbvg3bsgp4eniwrn6thtd1">
+      <w:hyperlink w:history="1" r:id="rId_sxrz6ranbeuly7-z7ihm">
         <w:r>
           <w:rPr>
             <w:rStyle w:val="Hyperlink"/>
@@ -436,7 +473,7 @@
                 <w:sz w:val="20"/>
                 <w:szCs w:val="20"/>
               </w:rPr>
-              <w:t xml:space="preserve">0:42</w:t>
+              <w:t xml:space="preserve">0:40</w:t>
             </w:r>
           </w:p>
         </w:tc>
@@ -550,7 +587,7 @@
                 <w:sz w:val="20"/>
                 <w:szCs w:val="20"/>
               </w:rPr>
-              <w:t xml:space="preserve">0:42</w:t>
+              <w:t xml:space="preserve">0:40</w:t>
             </w:r>
           </w:p>
         </w:tc>
@@ -578,7 +615,7 @@
                 <w:sz w:val="20"/>
                 <w:szCs w:val="20"/>
               </w:rPr>
-              <w:t xml:space="preserve">0:48</w:t>
+              <w:t xml:space="preserve">0:49</w:t>
             </w:r>
           </w:p>
         </w:tc>
@@ -692,7 +729,7 @@
                 <w:sz w:val="20"/>
                 <w:szCs w:val="20"/>
               </w:rPr>
-              <w:t xml:space="preserve">1:30</w:t>
+              <w:t xml:space="preserve">1:29</w:t>
             </w:r>
           </w:p>
         </w:tc>
@@ -720,7 +757,7 @@
                 <w:sz w:val="20"/>
                 <w:szCs w:val="20"/>
               </w:rPr>
-              <w:t xml:space="preserve">1:10</w:t>
+              <w:t xml:space="preserve">1:15</w:t>
             </w:r>
           </w:p>
         </w:tc>
@@ -834,7 +871,7 @@
                 <w:sz w:val="20"/>
                 <w:szCs w:val="20"/>
               </w:rPr>
-              <w:t xml:space="preserve">2:40</w:t>
+              <w:t xml:space="preserve">2:44</w:t>
             </w:r>
           </w:p>
         </w:tc>
@@ -862,7 +899,7 @@
                 <w:sz w:val="20"/>
                 <w:szCs w:val="20"/>
               </w:rPr>
-              <w:t xml:space="preserve">0:45</w:t>
+              <w:t xml:space="preserve">0:44</w:t>
             </w:r>
           </w:p>
         </w:tc>
@@ -976,7 +1013,7 @@
                 <w:sz w:val="20"/>
                 <w:szCs w:val="20"/>
               </w:rPr>
-              <w:t xml:space="preserve">3:25</w:t>
+              <w:t xml:space="preserve">3:28</w:t>
             </w:r>
           </w:p>
         </w:tc>
@@ -1004,7 +1041,7 @@
                 <w:sz w:val="20"/>
                 <w:szCs w:val="20"/>
               </w:rPr>
-              <w:t xml:space="preserve">0:42</w:t>
+              <w:t xml:space="preserve">0:37</w:t>
             </w:r>
           </w:p>
         </w:tc>
@@ -1118,7 +1155,7 @@
                 <w:sz w:val="20"/>
                 <w:szCs w:val="20"/>
               </w:rPr>
-              <w:t xml:space="preserve">4:07</w:t>
+              <w:t xml:space="preserve">4:05</w:t>
             </w:r>
           </w:p>
         </w:tc>
@@ -1146,7 +1183,7 @@
                 <w:sz w:val="20"/>
                 <w:szCs w:val="20"/>
               </w:rPr>
-              <w:t xml:space="preserve">0:53</w:t>
+              <w:t xml:space="preserve">0:55</w:t>
             </w:r>
           </w:p>
         </w:tc>
@@ -3762,7 +3799,7 @@
         <w:t xml:space="preserve">Tiempo: </w:t>
       </w:r>
       <w:r>
-        <w:t xml:space="preserve">0:00 a 0:42 (0:42)   ·   </w:t>
+        <w:t xml:space="preserve">0:00 a 0:40 (0:40)   ·   </w:t>
       </w:r>
       <w:r>
         <w:rPr>
@@ -3790,7 +3827,7 @@
         <w:rPr>
           <w:color w:val="555555"/>
         </w:rPr>
-        <w:t xml:space="preserve">Portada de NuevaMente (pantalla quieta, sin animaciones)</w:t>
+        <w:t xml:space="preserve">Pantalla de inicio de Kairos con el logo completo (quieta, sin animaciones)</w:t>
       </w:r>
     </w:p>
     <w:tbl>
@@ -3969,7 +4006,7 @@
         <w:t xml:space="preserve">Tiempo: </w:t>
       </w:r>
       <w:r>
-        <w:t xml:space="preserve">0:42 a 1:30 (0:48)   ·   </w:t>
+        <w:t xml:space="preserve">0:40 a 1:29 (0:49)   ·   </w:t>
       </w:r>
       <w:r>
         <w:rPr>
@@ -4051,7 +4088,7 @@
               <w:spacing w:after="120"/>
             </w:pPr>
             <w:r>
-              <w:t xml:space="preserve">“Soy Diana Dure, QA Tester, y mi trabajo es desconfiar. Por eso les presento NuevaMente: una IA que no puede inventar sin que lo detectemos.</w:t>
+              <w:t xml:space="preserve">“Soy Diana Dure, QA Tester, y mi trabajo es desconfiar. Por eso les presento Kairos, una plataforma de aprendizaje empresarial con una IA que no puede inventar sin que lo detectemos.</w:t>
             </w:r>
           </w:p>
           <w:p>
@@ -4163,7 +4200,7 @@
         <w:t xml:space="preserve">Tiempo: </w:t>
       </w:r>
       <w:r>
-        <w:t xml:space="preserve">1:30 a 2:40 (1:10)   ·   </w:t>
+        <w:t xml:space="preserve">1:29 a 2:44 (1:15)   ·   </w:t>
       </w:r>
       <w:r>
         <w:rPr>
@@ -4446,7 +4483,7 @@
         <w:t xml:space="preserve">Tiempo: </w:t>
       </w:r>
       <w:r>
-        <w:t xml:space="preserve">2:40 a 3:25 (0:45)   ·   </w:t>
+        <w:t xml:space="preserve">2:44 a 3:28 (0:44)   ·   </w:t>
       </w:r>
       <w:r>
         <w:rPr>
@@ -4640,7 +4677,7 @@
         <w:t xml:space="preserve">Tiempo: </w:t>
       </w:r>
       <w:r>
-        <w:t xml:space="preserve">3:25 a 4:07 (0:42)   ·   </w:t>
+        <w:t xml:space="preserve">3:28 a 4:05 (0:37)   ·   </w:t>
       </w:r>
       <w:r>
         <w:rPr>
@@ -4738,15 +4775,7 @@
               <w:spacing w:after="120"/>
             </w:pPr>
             <w:r>
-              <w:t xml:space="preserve">Doscientas noventa y cinco pruebas automatizadas, todas en verde, incluidas pruebas con documentos maliciosos que intentan darle órdenes a la IA.</w:t>
-            </w:r>
-          </w:p>
-          <w:p>
-            <w:pPr>
-              <w:spacing w:after="120"/>
-            </w:pPr>
-            <w:r>
-              <w:t xml:space="preserve">Cumplimos 16 de los 18 puntos del enunciado. Y está en producción en un servidor gratuito de 512 megas: para que entrara, optimizamos el video de 78 a 9 segundos de procesamiento. Cada cifra que les doy tiene su evidencia en el repositorio.”</w:t>
+              <w:t xml:space="preserve">Casi trescientas pruebas automatizadas, incluidas pruebas con documentos maliciosos que intentan darle órdenes a la IA. Cumplimos 17 de los 18 puntos del enunciado: la aplicación está en línea y cada material queda guardado en Oracle Cloud. Cada cifra que les doy tiene su evidencia en el repositorio.”</w:t>
             </w:r>
           </w:p>
         </w:tc>
@@ -4808,7 +4837,7 @@
           </w:p>
           <w:p>
             <w:r>
-              <w:t xml:space="preserve">Resultados medidos y comprobables, no promesas.</w:t>
+              <w:t xml:space="preserve">Resultados medidos y comprobables: fidelidad, pruebas y la nube de Oracle funcionando.</w:t>
             </w:r>
           </w:p>
         </w:tc>
@@ -4842,7 +4871,7 @@
         <w:t xml:space="preserve">Tiempo: </w:t>
       </w:r>
       <w:r>
-        <w:t xml:space="preserve">4:07 a 5:00 (0:53)   ·   </w:t>
+        <w:t xml:space="preserve">4:05 a 5:00 (0:55)   ·   </w:t>
       </w:r>
       <w:r>
         <w:rPr>
@@ -4961,7 +4990,7 @@
               <w:spacing w:after="120"/>
             </w:pPr>
             <w:r>
-              <w:t xml:space="preserve">NuevaMente: el conocimiento de su organización, al nivel de cada persona, sin inventar nada.</w:t>
+              <w:t xml:space="preserve">Kairos: el conocimiento de su organización, al nivel de cada persona, sin inventar nada.</w:t>
             </w:r>
           </w:p>
           <w:p>
@@ -5086,7 +5115,7 @@
         <w:spacing w:after="120"/>
       </w:pPr>
       <w:r>
-        <w:t xml:space="preserve">ChatGPT no demuestra de dónde sale cada dato. NuevaMente verifica cada afirmación contra el documento, rechaza lo que no tiene respaldo y entrega el material listo en seis formatos y para cuatro perfiles.</w:t>
+        <w:t xml:space="preserve">ChatGPT no demuestra de dónde sale cada dato. Kairos verifica cada afirmación contra el documento, rechaza lo que no tiene respaldo y entrega el material listo en seis formatos y para cuatro perfiles.</w:t>
       </w:r>
     </w:p>
     <w:p>
@@ -5140,7 +5169,7 @@
         <w:spacing w:after="120"/>
       </w:pPr>
       <w:r>
-        <w:t xml:space="preserve">Hoy corre en el plan gratuito de Render y con la cuota gratuita de Gemini. Si Gemini no responde, usa otros proveedores o el modo local, así que no depende de un solo servicio.</w:t>
+        <w:t xml:space="preserve">Hoy corre en el plan gratuito de Render, con la cuota gratuita de Gemini y la capa Always Free de Oracle Cloud. Si Gemini no responde, usa otros proveedores o el modo local, así que no depende de un solo servicio.</w:t>
       </w:r>
     </w:p>
     <w:p>
@@ -5167,7 +5196,7 @@
         <w:spacing w:after="120"/>
       </w:pPr>
       <w:r>
-        <w:t xml:space="preserve">Sí. La integración con OCI Object Storage está en el código y el despliegue en OCI Compute tiene script, systemd y nginx listos. Mientras se registra la llave de API en la cuenta, la app guarda en un respaldo local y lo indica en la respuesta.</w:t>
+        <w:t xml:space="preserve">Sí. Cada documento original y cada material generado se guardan en un bucket privado de OCI Object Storage; la interfaz muestra dónde quedó guardado. El despliegue en OCI Compute tiene script, systemd y nginx listos, y es el siguiente paso.</w:t>
       </w:r>
     </w:p>
     <w:p>
@@ -5275,7 +5304,7 @@
         <w:spacing w:after="120"/>
       </w:pPr>
       <w:r>
-        <w:t xml:space="preserve">Completar la verificación en OCI, ampliar los sectores y llevar un piloto a una institución de salud real para medir las horas de capacitación ahorradas.</w:t>
+        <w:t xml:space="preserve">Desplegar en OCI Compute, ampliar los sectores y llevar un piloto a una institución de salud real para medir las horas de capacitación ahorradas.</w:t>
       </w:r>
     </w:p>
     <w:p>
@@ -5331,7 +5360,7 @@
         <w:spacing w:after="80"/>
       </w:pPr>
       <w:r>
-        <w:t xml:space="preserve">☐  Grabar un video de la demo (unos 70 segundos) como plan B.</w:t>
+        <w:t xml:space="preserve">☐  No generar el video en vivo: el servidor gratuito tiene 512 MB y un video en vivo puede reiniciarlo. Mostrar el video ya generado.</w:t>
       </w:r>
     </w:p>
     <w:p>
@@ -5344,15 +5373,7 @@
         <w:spacing w:after="80"/>
       </w:pPr>
       <w:r>
-        <w:t xml:space="preserve">☐  Repasar las preguntas del jurado: cada integrante practica en voz alta las que le tocan.</w:t>
-      </w:r>
-    </w:p>
-    <w:p>
-      <w:pPr>
-        <w:pStyle w:val="Heading2"/>
-      </w:pPr>
-      <w:r>
-        <w:t xml:space="preserve">30 minutos antes</w:t>
+        <w:t xml:space="preserve">☐  Grabar un video de la demo (unos 70 segundos) como plan B.</w:t>
       </w:r>
     </w:p>
     <w:p>
@@ -5365,7 +5386,15 @@
         <w:spacing w:after="80"/>
       </w:pPr>
       <w:r>
-        <w:t xml:space="preserve">☐  Abrir la app en Render para que esté activa (la primera carga tarda cerca de un minuto).</w:t>
+        <w:t xml:space="preserve">☐  Repasar las preguntas del jurado: cada integrante practica en voz alta las que le tocan.</w:t>
+      </w:r>
+    </w:p>
+    <w:p>
+      <w:pPr>
+        <w:pStyle w:val="Heading2"/>
+      </w:pPr>
+      <w:r>
+        <w:t xml:space="preserve">30 minutos antes</w:t>
       </w:r>
     </w:p>
     <w:p>
@@ -5378,7 +5407,7 @@
         <w:spacing w:after="80"/>
       </w:pPr>
       <w:r>
-        <w:t xml:space="preserve">☐  Darío deja las pestañas en el orden del guion de pantallas y cierra todo lo demás.</w:t>
+        <w:t xml:space="preserve">☐  Abrir la app en Render para que esté activa (la primera carga tarda cerca de un minuto).</w:t>
       </w:r>
     </w:p>
     <w:p>
@@ -5391,15 +5420,7 @@
         <w:spacing w:after="80"/>
       </w:pPr>
       <w:r>
-        <w:t xml:space="preserve">☐  Silenciar notificaciones del sistema, correo y chats en la computadora que comparte pantalla.</w:t>
-      </w:r>
-    </w:p>
-    <w:p>
-      <w:pPr>
-        <w:pStyle w:val="Heading2"/>
-      </w:pPr>
-      <w:r>
-        <w:t xml:space="preserve">15 minutos antes</w:t>
+        <w:t xml:space="preserve">☐  Comprobar que el inicio muestre el logo de Kairos y que la barra diga «Guardando en OCI».</w:t>
       </w:r>
     </w:p>
     <w:p>
@@ -5412,7 +5433,7 @@
         <w:spacing w:after="80"/>
       </w:pPr>
       <w:r>
-        <w:t xml:space="preserve">☐  Entrar al evento y quedar atentos a las indicaciones de la organización.</w:t>
+        <w:t xml:space="preserve">☐  Darío deja las pestañas en el orden del guion de pantallas y cierra todo lo demás.</w:t>
       </w:r>
     </w:p>
     <w:p>
@@ -5425,7 +5446,15 @@
         <w:spacing w:after="80"/>
       </w:pPr>
       <w:r>
-        <w:t xml:space="preserve">☐  Probar micrófono, cámara y compartir pantalla.</w:t>
+        <w:t xml:space="preserve">☐  Silenciar notificaciones del sistema, correo y chats en la computadora que comparte pantalla.</w:t>
+      </w:r>
+    </w:p>
+    <w:p>
+      <w:pPr>
+        <w:pStyle w:val="Heading2"/>
+      </w:pPr>
+      <w:r>
+        <w:t xml:space="preserve">15 minutos antes</w:t>
       </w:r>
     </w:p>
     <w:p>
@@ -5438,15 +5467,7 @@
         <w:spacing w:after="80"/>
       </w:pPr>
       <w:r>
-        <w:t xml:space="preserve">☐  Confirmar orden de oradores y suplentes por el chat interno del equipo.</w:t>
-      </w:r>
-    </w:p>
-    <w:p>
-      <w:pPr>
-        <w:pStyle w:val="Heading2"/>
-      </w:pPr>
-      <w:r>
-        <w:t xml:space="preserve">Durante la presentación</w:t>
+        <w:t xml:space="preserve">☐  Entrar al evento y quedar atentos a las indicaciones de la organización.</w:t>
       </w:r>
     </w:p>
     <w:p>
@@ -5459,7 +5480,7 @@
         <w:spacing w:after="80"/>
       </w:pPr>
       <w:r>
-        <w:t xml:space="preserve">☐  Una sola persona habla a la vez; los demás con micrófono apagado.</w:t>
+        <w:t xml:space="preserve">☐  Probar micrófono, cámara y compartir pantalla.</w:t>
       </w:r>
     </w:p>
     <w:p>
@@ -5472,7 +5493,15 @@
         <w:spacing w:after="80"/>
       </w:pPr>
       <w:r>
-        <w:t xml:space="preserve">☐  Si la demo tarda más de 10 segundos, Darío cambia al video de respaldo sin comentarlo.</w:t>
+        <w:t xml:space="preserve">☐  Confirmar orden de oradores y suplentes por el chat interno del equipo.</w:t>
+      </w:r>
+    </w:p>
+    <w:p>
+      <w:pPr>
+        <w:pStyle w:val="Heading2"/>
+      </w:pPr>
+      <w:r>
+        <w:t xml:space="preserve">Durante la presentación</w:t>
       </w:r>
     </w:p>
     <w:p>
@@ -5485,15 +5514,7 @@
         <w:spacing w:after="80"/>
       </w:pPr>
       <w:r>
-        <w:t xml:space="preserve">☐  Si un orador pierde la conexión, entra su suplente desde el mismo bloque.</w:t>
-      </w:r>
-    </w:p>
-    <w:p>
-      <w:pPr>
-        <w:pStyle w:val="Heading2"/>
-      </w:pPr>
-      <w:r>
-        <w:t xml:space="preserve">En las preguntas</w:t>
+        <w:t xml:space="preserve">☐  Una sola persona habla a la vez; los demás con micrófono apagado.</w:t>
       </w:r>
     </w:p>
     <w:p>
@@ -5506,7 +5527,7 @@
         <w:spacing w:after="80"/>
       </w:pPr>
       <w:r>
-        <w:t xml:space="preserve">☐  Juan Pablo recibe la pregunta y nombra a quien responde.</w:t>
+        <w:t xml:space="preserve">☐  Si la demo tarda más de 10 segundos, Darío cambia al video de respaldo sin comentarlo.</w:t>
       </w:r>
     </w:p>
     <w:p>
@@ -5519,15 +5540,15 @@
         <w:spacing w:after="80"/>
       </w:pPr>
       <w:r>
-        <w:t xml:space="preserve">☐  Respuestas de 15 a 20 segundos, con un dato concreto. Si no se sabe algo, decirlo y explicar cómo se resolvería.</w:t>
-      </w:r>
-    </w:p>
-    <w:p>
-      <w:pPr>
-        <w:pStyle w:val="Heading1"/>
-      </w:pPr>
-      <w:r>
-        <w:t xml:space="preserve">Claves para ganar</w:t>
+        <w:t xml:space="preserve">☐  Si un orador pierde la conexión, entra su suplente desde el mismo bloque.</w:t>
+      </w:r>
+    </w:p>
+    <w:p>
+      <w:pPr>
+        <w:pStyle w:val="Heading2"/>
+      </w:pPr>
+      <w:r>
+        <w:t xml:space="preserve">En las preguntas</w:t>
       </w:r>
     </w:p>
     <w:p>
@@ -5540,7 +5561,7 @@
         <w:spacing w:after="80"/>
       </w:pPr>
       <w:r>
-        <w:t xml:space="preserve">Los primeros 10 segundos deciden la atención: decir la pregunta inicial de memoria, mirando al jurado.</w:t>
+        <w:t xml:space="preserve">☐  Juan Pablo recibe la pregunta y nombra a quien responde.</w:t>
       </w:r>
     </w:p>
     <w:p>
@@ -5553,7 +5574,15 @@
         <w:spacing w:after="80"/>
       </w:pPr>
       <w:r>
-        <w:t xml:space="preserve">Velocidad: unas 140 palabras por minuto. El texto tiene unas 600 palabras; con las pausas y las acciones de la demo da 5:00.</w:t>
+        <w:t xml:space="preserve">☐  Respuestas de 15 a 20 segundos, con un dato concreto. Si no se sabe algo, decirlo y explicar cómo se resolvería.</w:t>
+      </w:r>
+    </w:p>
+    <w:p>
+      <w:pPr>
+        <w:pStyle w:val="Heading1"/>
+      </w:pPr>
+      <w:r>
+        <w:t xml:space="preserve">Claves para ganar</w:t>
       </w:r>
     </w:p>
     <w:p>
@@ -5566,7 +5595,7 @@
         <w:spacing w:after="80"/>
       </w:pPr>
       <w:r>
-        <w:t xml:space="preserve">Ensayar al menos cinco veces con cronómetro. Si se pasan, recortar la frase del video en el bloque 3. Nunca acelerar el cierre.</w:t>
+        <w:t xml:space="preserve">Los primeros 10 segundos deciden la atención: decir la pregunta inicial de memoria, mirando al jurado.</w:t>
       </w:r>
     </w:p>
     <w:p>
@@ -5579,7 +5608,7 @@
         <w:spacing w:after="80"/>
       </w:pPr>
       <w:r>
-        <w:t xml:space="preserve">Plan B de la demo: tener el material ya generado en otra pestaña y un video grabado de la demo. Si algo tarda, cambiar sin comentarlo.</w:t>
+        <w:t xml:space="preserve">Velocidad: unas 140 palabras por minuto. El texto tiene unas 600 palabras; con las pausas y las acciones de la demo da 5:00.</w:t>
       </w:r>
     </w:p>
     <w:p>
@@ -5592,7 +5621,7 @@
         <w:spacing w:after="80"/>
       </w:pPr>
       <w:r>
-        <w:t xml:space="preserve">Abrir la aplicación 5 minutos antes para que Render esté activo; en el plan gratuito la primera carga tarda cerca de un minuto.</w:t>
+        <w:t xml:space="preserve">Ensayar al menos cinco veces con cronómetro. Si se pasan, recortar la frase del video en el bloque 3. Nunca acelerar el cierre.</w:t>
       </w:r>
     </w:p>
     <w:p>
@@ -5605,7 +5634,7 @@
         <w:spacing w:after="80"/>
       </w:pPr>
       <w:r>
-        <w:t xml:space="preserve">Cambio de orador sin silencio: quien termina mira a su compañera o compañero, y quien sigue empieza de inmediato.</w:t>
+        <w:t xml:space="preserve">Plan B de la demo: tener el material ya generado en otra pestaña y un video grabado de la demo. Si algo tarda, cambiar sin comentarlo.</w:t>
       </w:r>
     </w:p>
     <w:p>
@@ -5618,7 +5647,7 @@
         <w:spacing w:after="80"/>
       </w:pPr>
       <w:r>
-        <w:t xml:space="preserve">Decir los números despacio y con pausa: 1,00 · 295 pruebas · de 78 a 9 segundos. Son lo que el jurado anota.</w:t>
+        <w:t xml:space="preserve">Abrir la aplicación 5 minutos antes para que Render esté activo; en el plan gratuito la primera carga tarda cerca de un minuto.</w:t>
       </w:r>
     </w:p>
     <w:p>
@@ -5631,15 +5660,7 @@
         <w:spacing w:after="80"/>
       </w:pPr>
       <w:r>
-        <w:t xml:space="preserve">La frase final se dice lento, mirando al jurado, y se espera un segundo antes del “Gracias”.</w:t>
-      </w:r>
-    </w:p>
-    <w:p>
-      <w:pPr>
-        <w:pStyle w:val="Heading1"/>
-      </w:pPr>
-      <w:r>
-        <w:t xml:space="preserve">Enlaces</w:t>
+        <w:t xml:space="preserve">Cambio de orador sin silencio: quien termina mira a su compañera o compañero, y quien sigue empieza de inmediato.</w:t>
       </w:r>
     </w:p>
     <w:p>
@@ -5652,9 +5673,43 @@
         <w:spacing w:after="80"/>
       </w:pPr>
       <w:r>
+        <w:t xml:space="preserve">Decir los números despacio y con pausa: 1,00 · 0,92 · casi 300 pruebas · 17 de 18 puntos. Son lo que el jurado anota.</w:t>
+      </w:r>
+    </w:p>
+    <w:p>
+      <w:pPr>
+        <w:pStyle w:val="ListParagraph"/>
+        <w:numPr>
+          <w:ilvl w:val="0"/>
+          <w:numId w:val="2"/>
+        </w:numPr>
+        <w:spacing w:after="80"/>
+      </w:pPr>
+      <w:r>
+        <w:t xml:space="preserve">La frase final se dice lento, mirando al jurado, y se espera un segundo antes del “Gracias”.</w:t>
+      </w:r>
+    </w:p>
+    <w:p>
+      <w:pPr>
+        <w:pStyle w:val="Heading1"/>
+      </w:pPr>
+      <w:r>
+        <w:t xml:space="preserve">Enlaces</w:t>
+      </w:r>
+    </w:p>
+    <w:p>
+      <w:pPr>
+        <w:pStyle w:val="ListParagraph"/>
+        <w:numPr>
+          <w:ilvl w:val="0"/>
+          <w:numId w:val="2"/>
+        </w:numPr>
+        <w:spacing w:after="80"/>
+      </w:pPr>
+      <w:r>
         <w:t xml:space="preserve">Aplicación en línea: </w:t>
       </w:r>
-      <w:hyperlink w:history="1" r:id="rIdypab4eoctukblk1haiq4r">
+      <w:hyperlink w:history="1" r:id="rIdlhciczo6btgwejt89afji">
         <w:r>
           <w:rPr>
             <w:rStyle w:val="Hyperlink"/>
@@ -5675,7 +5730,7 @@
       <w:r>
         <w:t xml:space="preserve">Repositorio en GitHub: </w:t>
       </w:r>
-      <w:hyperlink w:history="1" r:id="rIdp529xvhkc55knmh_xy9hi">
+      <w:hyperlink w:history="1" r:id="rIdxy2y2kl3rs5q9xwb5ixzv">
         <w:r>
           <w:rPr>
             <w:rStyle w:val="Hyperlink"/>
@@ -5696,7 +5751,7 @@
       <w:r>
         <w:t xml:space="preserve">Backlog en Jira: </w:t>
       </w:r>
-      <w:hyperlink w:history="1" r:id="rId_af5yy7quo2p77qcsjsvh">
+      <w:hyperlink w:history="1" r:id="rId05igwz-on01poklrhovud">
         <w:r>
           <w:rPr>
             <w:rStyle w:val="Hyperlink"/>
@@ -5765,7 +5820,7 @@
         <w:sz w:val="18"/>
         <w:szCs w:val="18"/>
       </w:rPr>
-      <w:t xml:space="preserve">NuevaMente · Kairos G10 · Demo Day · Página </w:t>
+      <w:t xml:space="preserve">Kairos · Equipo Kairos G10 · Demo Day · Página </w:t>
     </w:r>
     <w:r>
       <w:rPr>

</xml_diff>